<commit_message>
Point AdaptiveEdu workflow and docs at the new Google Sheets IDs.
Use tab-name mode for Sheets nodes so column options resolve on the new spreadsheets.

Co-authored-by: Cursor <cursoragent@cursor.com>
</commit_message>
<xml_diff>
--- a/AdaptiveEdu_Project_Documentation.docx
+++ b/AdaptiveEdu_Project_Documentation.docx
@@ -1357,7 +1357,7 @@
           <w:color w:val="0E8C7E"/>
           <w:sz w:val="22"/>
         </w:rPr>
-        <w:t>https://docs.google.com/spreadsheets/d/1m8rzYDXa7817vFFcd1bqszegV0orMgxA8AyyOEyYl1s</w:t>
+        <w:t>https://docs.google.com/spreadsheets/d/1ddIwenYjiwKryP7Pogxe-7qsjKnTmtfCtAlDoplSn5Q</w:t>
       </w:r>
     </w:p>
     <w:p>
@@ -1851,7 +1851,7 @@
           <w:color w:val="0E8C7E"/>
           <w:sz w:val="22"/>
         </w:rPr>
-        <w:t>https://docs.google.com/spreadsheets/d/1FUfTrazMkwUSOi1NzrC9D4FKqGhTUJ1KPdb-lLCUyY0</w:t>
+        <w:t>https://docs.google.com/spreadsheets/d/1akeM65odle57kxtR7M5LqFMnxCsHX3M1cJKKltExFEg</w:t>
       </w:r>
     </w:p>
     <w:p>
@@ -2431,7 +2431,7 @@
           <w:color w:val="0E8C7E"/>
           <w:sz w:val="22"/>
         </w:rPr>
-        <w:t>https://docs.google.com/spreadsheets/d/18C6AQaF5evsGaI4upz1vxbCgnE8jhxJfVfQS3-R5KPk</w:t>
+        <w:t>https://docs.google.com/spreadsheets/d/1II6ckyiKFucKsC38PC_0a9tH1h8H0JZe3qaclLxCExY</w:t>
       </w:r>
     </w:p>
     <w:p>

</xml_diff>

<commit_message>
Update live n8n canvas screenshot and sanitized ADAPTIVE_14 export.
Replace the workflow JSON from the working cloud instance (credentials stay in n8n; PDFShift key placeholder only) and refresh PPT/docs canvas evidence of a successful register path.

Co-authored-by: Cursor <cursoragent@cursor.com>
</commit_message>
<xml_diff>
--- a/AdaptiveEdu_Project_Documentation.docx
+++ b/AdaptiveEdu_Project_Documentation.docx
@@ -887,7 +887,7 @@
       <w:r>
         <w:drawing>
           <wp:inline xmlns:a="http://schemas.openxmlformats.org/drawingml/2006/main" xmlns:pic="http://schemas.openxmlformats.org/drawingml/2006/picture">
-            <wp:extent cx="5669280" cy="1820188"/>
+            <wp:extent cx="5669280" cy="1511439"/>
             <wp:docPr id="1" name="Picture 1"/>
             <wp:cNvGraphicFramePr>
               <a:graphicFrameLocks noChangeAspect="1"/>
@@ -908,7 +908,7 @@
                   <pic:spPr>
                     <a:xfrm>
                       <a:off x="0" y="0"/>
-                      <a:ext cx="5669280" cy="1820188"/>
+                      <a:ext cx="5669280" cy="1511439"/>
                     </a:xfrm>
                     <a:prstGeom prst="rect"/>
                   </pic:spPr>
@@ -931,7 +931,7 @@
           <w:color w:val="5A6676"/>
           <w:sz w:val="20"/>
         </w:rPr>
-        <w:t>Figure 1 — Live n8n canvas: ADAPTIVE_14 (~46 nodes).</w:t>
+        <w:t>Figure 1 — Live n8n canvas (ADAPTIVE_14, ~46 nodes): successful register path highlighted (ID → subjects list).</w:t>
       </w:r>
     </w:p>
     <w:p>

</xml_diff>